<commit_message>
Sutvarkyti atstumai, paruošta tuščia PavadinimaiFunkcija.py
</commit_message>
<xml_diff>
--- a/CMD_komandos.docx
+++ b/CMD_komandos.docx
@@ -822,15 +822,651 @@
         </w:rPr>
         <w:t xml:space="preserve">6. </w:t>
       </w:r>
-    </w:p>
-    <w:p>
-      <w:pPr>
-        <w:spacing w:after="0"/>
-        <w:jc w:val="both"/>
-        <w:rPr>
-          <w:rFonts w:ascii="Times New Roman" w:hAnsi="Times New Roman" w:cs="Times New Roman"/>
-        </w:rPr>
-      </w:pPr>
+      <w:r>
+        <w:rPr>
+          <w:rFonts w:ascii="Times New Roman" w:hAnsi="Times New Roman" w:cs="Times New Roman"/>
+        </w:rPr>
+        <w:t>Padaromas pirmasis įrašas</w:t>
+      </w:r>
+      <w:r>
+        <w:rPr>
+          <w:rFonts w:ascii="Times New Roman" w:hAnsi="Times New Roman" w:cs="Times New Roman"/>
+        </w:rPr>
+        <w:t xml:space="preserve">, pvz.: </w:t>
+      </w:r>
+      <w:proofErr w:type="spellStart"/>
+      <w:r>
+        <w:rPr>
+          <w:rFonts w:ascii="Times New Roman" w:hAnsi="Times New Roman" w:cs="Times New Roman"/>
+        </w:rPr>
+        <w:t>git</w:t>
+      </w:r>
+      <w:proofErr w:type="spellEnd"/>
+      <w:r>
+        <w:rPr>
+          <w:rFonts w:ascii="Times New Roman" w:hAnsi="Times New Roman" w:cs="Times New Roman"/>
+        </w:rPr>
+        <w:t xml:space="preserve"> </w:t>
+      </w:r>
+      <w:proofErr w:type="spellStart"/>
+      <w:r>
+        <w:rPr>
+          <w:rFonts w:ascii="Times New Roman" w:hAnsi="Times New Roman" w:cs="Times New Roman"/>
+        </w:rPr>
+        <w:t>commit</w:t>
+      </w:r>
+      <w:proofErr w:type="spellEnd"/>
+      <w:r>
+        <w:rPr>
+          <w:rFonts w:ascii="Times New Roman" w:hAnsi="Times New Roman" w:cs="Times New Roman"/>
+        </w:rPr>
+        <w:t xml:space="preserve"> -m "</w:t>
+      </w:r>
+      <w:proofErr w:type="spellStart"/>
+      <w:r>
+        <w:rPr>
+          <w:rFonts w:ascii="Times New Roman" w:hAnsi="Times New Roman" w:cs="Times New Roman"/>
+        </w:rPr>
+        <w:t>Initial</w:t>
+      </w:r>
+      <w:proofErr w:type="spellEnd"/>
+      <w:r>
+        <w:rPr>
+          <w:rFonts w:ascii="Times New Roman" w:hAnsi="Times New Roman" w:cs="Times New Roman"/>
+        </w:rPr>
+        <w:t xml:space="preserve"> </w:t>
+      </w:r>
+      <w:proofErr w:type="spellStart"/>
+      <w:r>
+        <w:rPr>
+          <w:rFonts w:ascii="Times New Roman" w:hAnsi="Times New Roman" w:cs="Times New Roman"/>
+        </w:rPr>
+        <w:t>commit</w:t>
+      </w:r>
+      <w:proofErr w:type="spellEnd"/>
+      <w:r>
+        <w:rPr>
+          <w:rFonts w:ascii="Times New Roman" w:hAnsi="Times New Roman" w:cs="Times New Roman"/>
+        </w:rPr>
+        <w:t>: pridėtas atstumų skaičiavimo modulis"</w:t>
+      </w:r>
+    </w:p>
+    <w:p>
+      <w:pPr>
+        <w:spacing w:after="0"/>
+        <w:jc w:val="both"/>
+        <w:rPr>
+          <w:rFonts w:ascii="Times New Roman" w:hAnsi="Times New Roman" w:cs="Times New Roman"/>
+        </w:rPr>
+      </w:pPr>
+      <w:r>
+        <w:rPr>
+          <w:rFonts w:ascii="Times New Roman" w:hAnsi="Times New Roman" w:cs="Times New Roman"/>
+        </w:rPr>
+        <w:t xml:space="preserve">7. Sujungimas su </w:t>
+      </w:r>
+      <w:proofErr w:type="spellStart"/>
+      <w:r>
+        <w:rPr>
+          <w:rFonts w:ascii="Times New Roman" w:hAnsi="Times New Roman" w:cs="Times New Roman"/>
+        </w:rPr>
+        <w:t>GitHub</w:t>
+      </w:r>
+      <w:proofErr w:type="spellEnd"/>
+      <w:r>
+        <w:rPr>
+          <w:rFonts w:ascii="Times New Roman" w:hAnsi="Times New Roman" w:cs="Times New Roman"/>
+        </w:rPr>
+        <w:t xml:space="preserve">: </w:t>
+      </w:r>
+      <w:r>
+        <w:rPr>
+          <w:rFonts w:ascii="Times New Roman" w:hAnsi="Times New Roman" w:cs="Times New Roman"/>
+        </w:rPr>
+        <w:t xml:space="preserve">šioje svetainėje po saugyklos sukūrimo atsiranda krūva komandų, iš kurių reikia susirasti kažką panašaus į </w:t>
+      </w:r>
+      <w:r>
+        <w:rPr>
+          <w:rFonts w:ascii="Times New Roman" w:hAnsi="Times New Roman" w:cs="Times New Roman"/>
+        </w:rPr>
+        <w:t>„</w:t>
+      </w:r>
+      <w:proofErr w:type="spellStart"/>
+      <w:r>
+        <w:rPr>
+          <w:rFonts w:ascii="Times New Roman" w:hAnsi="Times New Roman" w:cs="Times New Roman"/>
+        </w:rPr>
+        <w:t>git</w:t>
+      </w:r>
+      <w:proofErr w:type="spellEnd"/>
+      <w:r>
+        <w:rPr>
+          <w:rFonts w:ascii="Times New Roman" w:hAnsi="Times New Roman" w:cs="Times New Roman"/>
+        </w:rPr>
+        <w:t xml:space="preserve"> </w:t>
+      </w:r>
+      <w:proofErr w:type="spellStart"/>
+      <w:r>
+        <w:rPr>
+          <w:rFonts w:ascii="Times New Roman" w:hAnsi="Times New Roman" w:cs="Times New Roman"/>
+        </w:rPr>
+        <w:t>remote</w:t>
+      </w:r>
+      <w:proofErr w:type="spellEnd"/>
+      <w:r>
+        <w:rPr>
+          <w:rFonts w:ascii="Times New Roman" w:hAnsi="Times New Roman" w:cs="Times New Roman"/>
+        </w:rPr>
+        <w:t xml:space="preserve"> </w:t>
+      </w:r>
+      <w:proofErr w:type="spellStart"/>
+      <w:r>
+        <w:rPr>
+          <w:rFonts w:ascii="Times New Roman" w:hAnsi="Times New Roman" w:cs="Times New Roman"/>
+        </w:rPr>
+        <w:t>add</w:t>
+      </w:r>
+      <w:proofErr w:type="spellEnd"/>
+      <w:r>
+        <w:rPr>
+          <w:rFonts w:ascii="Times New Roman" w:hAnsi="Times New Roman" w:cs="Times New Roman"/>
+        </w:rPr>
+        <w:t xml:space="preserve"> </w:t>
+      </w:r>
+      <w:proofErr w:type="spellStart"/>
+      <w:r>
+        <w:rPr>
+          <w:rFonts w:ascii="Times New Roman" w:hAnsi="Times New Roman" w:cs="Times New Roman"/>
+        </w:rPr>
+        <w:t>origin</w:t>
+      </w:r>
+      <w:proofErr w:type="spellEnd"/>
+      <w:r>
+        <w:rPr>
+          <w:rFonts w:ascii="Times New Roman" w:hAnsi="Times New Roman" w:cs="Times New Roman"/>
+        </w:rPr>
+        <w:t xml:space="preserve"> https://github.com/TomasVilkickas/Skaiciavimai.git</w:t>
+      </w:r>
+      <w:r>
+        <w:rPr>
+          <w:rFonts w:ascii="Times New Roman" w:hAnsi="Times New Roman" w:cs="Times New Roman"/>
+        </w:rPr>
+        <w:t>“</w:t>
+      </w:r>
+      <w:r>
+        <w:rPr>
+          <w:rFonts w:ascii="Times New Roman" w:hAnsi="Times New Roman" w:cs="Times New Roman"/>
+        </w:rPr>
+        <w:t>, nusikopijuoti į terminalą ir paleisti.</w:t>
+      </w:r>
+    </w:p>
+    <w:p>
+      <w:pPr>
+        <w:spacing w:after="0"/>
+        <w:jc w:val="both"/>
+        <w:rPr>
+          <w:rFonts w:ascii="Times New Roman" w:hAnsi="Times New Roman" w:cs="Times New Roman"/>
+        </w:rPr>
+      </w:pPr>
+      <w:r>
+        <w:rPr>
+          <w:rFonts w:ascii="Times New Roman" w:hAnsi="Times New Roman" w:cs="Times New Roman"/>
+        </w:rPr>
+        <w:t xml:space="preserve">8. </w:t>
+      </w:r>
+      <w:r>
+        <w:rPr>
+          <w:rFonts w:ascii="Times New Roman" w:hAnsi="Times New Roman" w:cs="Times New Roman"/>
+        </w:rPr>
+        <w:t>Failų išsiuntimas: terminale „</w:t>
+      </w:r>
+      <w:proofErr w:type="spellStart"/>
+      <w:r>
+        <w:rPr>
+          <w:rFonts w:ascii="Times New Roman" w:hAnsi="Times New Roman" w:cs="Times New Roman"/>
+        </w:rPr>
+        <w:t>git</w:t>
+      </w:r>
+      <w:proofErr w:type="spellEnd"/>
+      <w:r>
+        <w:rPr>
+          <w:rFonts w:ascii="Times New Roman" w:hAnsi="Times New Roman" w:cs="Times New Roman"/>
+        </w:rPr>
+        <w:t xml:space="preserve"> </w:t>
+      </w:r>
+      <w:proofErr w:type="spellStart"/>
+      <w:r>
+        <w:rPr>
+          <w:rFonts w:ascii="Times New Roman" w:hAnsi="Times New Roman" w:cs="Times New Roman"/>
+        </w:rPr>
+        <w:t>push</w:t>
+      </w:r>
+      <w:proofErr w:type="spellEnd"/>
+      <w:r>
+        <w:rPr>
+          <w:rFonts w:ascii="Times New Roman" w:hAnsi="Times New Roman" w:cs="Times New Roman"/>
+        </w:rPr>
+        <w:t xml:space="preserve"> -u </w:t>
+      </w:r>
+      <w:proofErr w:type="spellStart"/>
+      <w:r>
+        <w:rPr>
+          <w:rFonts w:ascii="Times New Roman" w:hAnsi="Times New Roman" w:cs="Times New Roman"/>
+        </w:rPr>
+        <w:t>origin</w:t>
+      </w:r>
+      <w:proofErr w:type="spellEnd"/>
+      <w:r>
+        <w:rPr>
+          <w:rFonts w:ascii="Times New Roman" w:hAnsi="Times New Roman" w:cs="Times New Roman"/>
+        </w:rPr>
+        <w:t xml:space="preserve"> </w:t>
+      </w:r>
+      <w:proofErr w:type="spellStart"/>
+      <w:r>
+        <w:rPr>
+          <w:rFonts w:ascii="Times New Roman" w:hAnsi="Times New Roman" w:cs="Times New Roman"/>
+        </w:rPr>
+        <w:t>main</w:t>
+      </w:r>
+      <w:proofErr w:type="spellEnd"/>
+      <w:r>
+        <w:rPr>
+          <w:rFonts w:ascii="Times New Roman" w:hAnsi="Times New Roman" w:cs="Times New Roman"/>
+        </w:rPr>
+        <w:t>“</w:t>
+      </w:r>
+    </w:p>
+    <w:p>
+      <w:pPr>
+        <w:spacing w:after="0"/>
+        <w:jc w:val="both"/>
+        <w:rPr>
+          <w:rFonts w:ascii="Times New Roman" w:hAnsi="Times New Roman" w:cs="Times New Roman"/>
+        </w:rPr>
+      </w:pPr>
+      <w:r>
+        <w:rPr>
+          <w:rFonts w:ascii="Times New Roman" w:hAnsi="Times New Roman" w:cs="Times New Roman"/>
+        </w:rPr>
+        <w:t xml:space="preserve">9. Po šios komandos </w:t>
+      </w:r>
+      <w:proofErr w:type="spellStart"/>
+      <w:r>
+        <w:rPr>
+          <w:rFonts w:ascii="Times New Roman" w:hAnsi="Times New Roman" w:cs="Times New Roman"/>
+        </w:rPr>
+        <w:t>GitHub</w:t>
+      </w:r>
+      <w:proofErr w:type="spellEnd"/>
+      <w:r>
+        <w:rPr>
+          <w:rFonts w:ascii="Times New Roman" w:hAnsi="Times New Roman" w:cs="Times New Roman"/>
+        </w:rPr>
+        <w:t xml:space="preserve"> puslapyje paspausti rodyklę </w:t>
+      </w:r>
+      <w:proofErr w:type="spellStart"/>
+      <w:r>
+        <w:rPr>
+          <w:rFonts w:ascii="Times New Roman" w:hAnsi="Times New Roman" w:cs="Times New Roman"/>
+        </w:rPr>
+        <w:t>refresh</w:t>
+      </w:r>
+      <w:proofErr w:type="spellEnd"/>
+      <w:r>
+        <w:rPr>
+          <w:rFonts w:ascii="Times New Roman" w:hAnsi="Times New Roman" w:cs="Times New Roman"/>
+        </w:rPr>
+        <w:t xml:space="preserve"> „atnaujinti puslapį“ ir atsiras visi failai.</w:t>
+      </w:r>
+    </w:p>
+    <w:p>
+      <w:pPr>
+        <w:spacing w:after="0"/>
+        <w:jc w:val="both"/>
+        <w:rPr>
+          <w:rFonts w:ascii="Times New Roman" w:hAnsi="Times New Roman" w:cs="Times New Roman"/>
+        </w:rPr>
+      </w:pPr>
+    </w:p>
+    <w:p>
+      <w:pPr>
+        <w:spacing w:after="0"/>
+        <w:jc w:val="both"/>
+        <w:rPr>
+          <w:rFonts w:ascii="Times New Roman" w:hAnsi="Times New Roman" w:cs="Times New Roman"/>
+        </w:rPr>
+      </w:pPr>
+      <w:r>
+        <w:rPr>
+          <w:rFonts w:ascii="Times New Roman" w:hAnsi="Times New Roman" w:cs="Times New Roman"/>
+        </w:rPr>
+        <w:t xml:space="preserve">Kažką pakeitus, pridėjus naują funkciją ar dar ką padarius ir norint išsaugoti, tereikės trijų žingsnių terminale, norint išsaugoti pakeitimus </w:t>
+      </w:r>
+      <w:proofErr w:type="spellStart"/>
+      <w:r>
+        <w:rPr>
+          <w:rFonts w:ascii="Times New Roman" w:hAnsi="Times New Roman" w:cs="Times New Roman"/>
+        </w:rPr>
+        <w:t>GitHub‘e</w:t>
+      </w:r>
+      <w:proofErr w:type="spellEnd"/>
+      <w:r>
+        <w:rPr>
+          <w:rFonts w:ascii="Times New Roman" w:hAnsi="Times New Roman" w:cs="Times New Roman"/>
+        </w:rPr>
+        <w:t xml:space="preserve"> (viskas daroma aktyvavus </w:t>
+      </w:r>
+      <w:proofErr w:type="spellStart"/>
+      <w:r>
+        <w:rPr>
+          <w:rFonts w:ascii="Times New Roman" w:hAnsi="Times New Roman" w:cs="Times New Roman"/>
+        </w:rPr>
+        <w:t>venv</w:t>
+      </w:r>
+      <w:proofErr w:type="spellEnd"/>
+      <w:r>
+        <w:rPr>
+          <w:rFonts w:ascii="Times New Roman" w:hAnsi="Times New Roman" w:cs="Times New Roman"/>
+        </w:rPr>
+        <w:t xml:space="preserve"> </w:t>
+      </w:r>
+      <w:r>
+        <w:rPr>
+          <w:rFonts w:ascii="Times New Roman" w:hAnsi="Times New Roman" w:cs="Times New Roman"/>
+        </w:rPr>
+        <w:t>ir tik projekto kataloge)</w:t>
+      </w:r>
+      <w:r>
+        <w:rPr>
+          <w:rFonts w:ascii="Times New Roman" w:hAnsi="Times New Roman" w:cs="Times New Roman"/>
+        </w:rPr>
+        <w:t>:</w:t>
+      </w:r>
+    </w:p>
+    <w:p>
+      <w:pPr>
+        <w:spacing w:after="0"/>
+        <w:jc w:val="both"/>
+        <w:rPr>
+          <w:rFonts w:ascii="Times New Roman" w:hAnsi="Times New Roman" w:cs="Times New Roman"/>
+        </w:rPr>
+      </w:pPr>
+      <w:r>
+        <w:rPr>
+          <w:rFonts w:ascii="Times New Roman" w:hAnsi="Times New Roman" w:cs="Times New Roman"/>
+        </w:rPr>
+        <w:t>1. „</w:t>
+      </w:r>
+      <w:proofErr w:type="spellStart"/>
+      <w:r>
+        <w:rPr>
+          <w:rFonts w:ascii="Times New Roman" w:hAnsi="Times New Roman" w:cs="Times New Roman"/>
+        </w:rPr>
+        <w:t>git</w:t>
+      </w:r>
+      <w:proofErr w:type="spellEnd"/>
+      <w:r>
+        <w:rPr>
+          <w:rFonts w:ascii="Times New Roman" w:hAnsi="Times New Roman" w:cs="Times New Roman"/>
+        </w:rPr>
+        <w:t xml:space="preserve"> </w:t>
+      </w:r>
+      <w:proofErr w:type="spellStart"/>
+      <w:r>
+        <w:rPr>
+          <w:rFonts w:ascii="Times New Roman" w:hAnsi="Times New Roman" w:cs="Times New Roman"/>
+        </w:rPr>
+        <w:t>add</w:t>
+      </w:r>
+      <w:proofErr w:type="spellEnd"/>
+      <w:r>
+        <w:rPr>
+          <w:rFonts w:ascii="Times New Roman" w:hAnsi="Times New Roman" w:cs="Times New Roman"/>
+        </w:rPr>
+        <w:t xml:space="preserve"> .</w:t>
+      </w:r>
+      <w:r>
+        <w:rPr>
+          <w:rFonts w:ascii="Times New Roman" w:hAnsi="Times New Roman" w:cs="Times New Roman"/>
+        </w:rPr>
+        <w:t>“</w:t>
+      </w:r>
+    </w:p>
+    <w:p>
+      <w:pPr>
+        <w:spacing w:after="0"/>
+        <w:jc w:val="both"/>
+        <w:rPr>
+          <w:rFonts w:ascii="Times New Roman" w:hAnsi="Times New Roman" w:cs="Times New Roman"/>
+        </w:rPr>
+      </w:pPr>
+      <w:r>
+        <w:rPr>
+          <w:rFonts w:ascii="Times New Roman" w:hAnsi="Times New Roman" w:cs="Times New Roman"/>
+        </w:rPr>
+        <w:t xml:space="preserve">2. </w:t>
+      </w:r>
+      <w:r>
+        <w:rPr>
+          <w:rFonts w:ascii="Times New Roman" w:hAnsi="Times New Roman" w:cs="Times New Roman"/>
+        </w:rPr>
+        <w:t>„</w:t>
+      </w:r>
+      <w:proofErr w:type="spellStart"/>
+      <w:r>
+        <w:rPr>
+          <w:rFonts w:ascii="Times New Roman" w:hAnsi="Times New Roman" w:cs="Times New Roman"/>
+        </w:rPr>
+        <w:t>git</w:t>
+      </w:r>
+      <w:proofErr w:type="spellEnd"/>
+      <w:r>
+        <w:rPr>
+          <w:rFonts w:ascii="Times New Roman" w:hAnsi="Times New Roman" w:cs="Times New Roman"/>
+        </w:rPr>
+        <w:t xml:space="preserve"> </w:t>
+      </w:r>
+      <w:proofErr w:type="spellStart"/>
+      <w:r>
+        <w:rPr>
+          <w:rFonts w:ascii="Times New Roman" w:hAnsi="Times New Roman" w:cs="Times New Roman"/>
+        </w:rPr>
+        <w:t>commit</w:t>
+      </w:r>
+      <w:proofErr w:type="spellEnd"/>
+      <w:r>
+        <w:rPr>
+          <w:rFonts w:ascii="Times New Roman" w:hAnsi="Times New Roman" w:cs="Times New Roman"/>
+        </w:rPr>
+        <w:t xml:space="preserve"> -m "Komentaras apie pakeitimą"</w:t>
+      </w:r>
+      <w:r>
+        <w:rPr>
+          <w:rFonts w:ascii="Times New Roman" w:hAnsi="Times New Roman" w:cs="Times New Roman"/>
+        </w:rPr>
+        <w:t>“</w:t>
+      </w:r>
+    </w:p>
+    <w:p>
+      <w:pPr>
+        <w:spacing w:after="0"/>
+        <w:jc w:val="both"/>
+        <w:rPr>
+          <w:rFonts w:ascii="Times New Roman" w:hAnsi="Times New Roman" w:cs="Times New Roman"/>
+        </w:rPr>
+      </w:pPr>
+      <w:r>
+        <w:rPr>
+          <w:rFonts w:ascii="Times New Roman" w:hAnsi="Times New Roman" w:cs="Times New Roman"/>
+        </w:rPr>
+        <w:t xml:space="preserve">3. </w:t>
+      </w:r>
+      <w:r>
+        <w:rPr>
+          <w:rFonts w:ascii="Times New Roman" w:hAnsi="Times New Roman" w:cs="Times New Roman"/>
+        </w:rPr>
+        <w:t>„</w:t>
+      </w:r>
+      <w:proofErr w:type="spellStart"/>
+      <w:r>
+        <w:rPr>
+          <w:rFonts w:ascii="Times New Roman" w:hAnsi="Times New Roman" w:cs="Times New Roman"/>
+        </w:rPr>
+        <w:t>git</w:t>
+      </w:r>
+      <w:proofErr w:type="spellEnd"/>
+      <w:r>
+        <w:rPr>
+          <w:rFonts w:ascii="Times New Roman" w:hAnsi="Times New Roman" w:cs="Times New Roman"/>
+        </w:rPr>
+        <w:t xml:space="preserve"> </w:t>
+      </w:r>
+      <w:proofErr w:type="spellStart"/>
+      <w:r>
+        <w:rPr>
+          <w:rFonts w:ascii="Times New Roman" w:hAnsi="Times New Roman" w:cs="Times New Roman"/>
+        </w:rPr>
+        <w:t>push</w:t>
+      </w:r>
+      <w:proofErr w:type="spellEnd"/>
+      <w:r>
+        <w:rPr>
+          <w:rFonts w:ascii="Times New Roman" w:hAnsi="Times New Roman" w:cs="Times New Roman"/>
+        </w:rPr>
+        <w:t>“.</w:t>
+      </w:r>
+    </w:p>
+    <w:p>
+      <w:pPr>
+        <w:spacing w:after="0"/>
+        <w:jc w:val="both"/>
+        <w:rPr>
+          <w:rFonts w:ascii="Times New Roman" w:hAnsi="Times New Roman" w:cs="Times New Roman"/>
+        </w:rPr>
+      </w:pPr>
+      <w:proofErr w:type="spellStart"/>
+      <w:r>
+        <w:rPr>
+          <w:rFonts w:ascii="Times New Roman" w:hAnsi="Times New Roman" w:cs="Times New Roman"/>
+        </w:rPr>
+        <w:t>GitHub‘e</w:t>
+      </w:r>
+      <w:proofErr w:type="spellEnd"/>
+      <w:r>
+        <w:rPr>
+          <w:rFonts w:ascii="Times New Roman" w:hAnsi="Times New Roman" w:cs="Times New Roman"/>
+        </w:rPr>
+        <w:t xml:space="preserve"> padarome </w:t>
+      </w:r>
+      <w:proofErr w:type="spellStart"/>
+      <w:r>
+        <w:rPr>
+          <w:rFonts w:ascii="Times New Roman" w:hAnsi="Times New Roman" w:cs="Times New Roman"/>
+        </w:rPr>
+        <w:t>refresh</w:t>
+      </w:r>
+      <w:proofErr w:type="spellEnd"/>
+      <w:r>
+        <w:rPr>
+          <w:rFonts w:ascii="Times New Roman" w:hAnsi="Times New Roman" w:cs="Times New Roman"/>
+        </w:rPr>
+        <w:t xml:space="preserve"> su rodykle ir viskas bus naujai.</w:t>
+      </w:r>
+    </w:p>
+    <w:p>
+      <w:pPr>
+        <w:spacing w:after="0"/>
+        <w:jc w:val="both"/>
+        <w:rPr>
+          <w:rFonts w:ascii="Times New Roman" w:hAnsi="Times New Roman" w:cs="Times New Roman"/>
+        </w:rPr>
+      </w:pPr>
+    </w:p>
+    <w:p>
+      <w:pPr>
+        <w:spacing w:after="0"/>
+        <w:jc w:val="both"/>
+        <w:rPr>
+          <w:rFonts w:ascii="Times New Roman" w:hAnsi="Times New Roman" w:cs="Times New Roman"/>
+        </w:rPr>
+      </w:pPr>
+      <w:r>
+        <w:rPr>
+          <w:rFonts w:ascii="Times New Roman" w:hAnsi="Times New Roman" w:cs="Times New Roman"/>
+        </w:rPr>
+        <w:lastRenderedPageBreak/>
+        <w:t>Padarius klaidą, uždėjus kodą</w:t>
+      </w:r>
+      <w:r>
+        <w:rPr>
+          <w:rFonts w:ascii="Times New Roman" w:hAnsi="Times New Roman" w:cs="Times New Roman"/>
+        </w:rPr>
+        <w:t xml:space="preserve"> ne tai funkcijai, atstatymas iš </w:t>
+      </w:r>
+      <w:proofErr w:type="spellStart"/>
+      <w:r>
+        <w:rPr>
+          <w:rFonts w:ascii="Times New Roman" w:hAnsi="Times New Roman" w:cs="Times New Roman"/>
+        </w:rPr>
+        <w:t>GitHub</w:t>
+      </w:r>
+      <w:proofErr w:type="spellEnd"/>
+      <w:r>
+        <w:rPr>
+          <w:rFonts w:ascii="Times New Roman" w:hAnsi="Times New Roman" w:cs="Times New Roman"/>
+        </w:rPr>
+        <w:t>: terminale:</w:t>
+      </w:r>
+    </w:p>
+    <w:p>
+      <w:pPr>
+        <w:spacing w:after="0"/>
+        <w:jc w:val="both"/>
+        <w:rPr>
+          <w:rFonts w:ascii="Times New Roman" w:hAnsi="Times New Roman" w:cs="Times New Roman"/>
+        </w:rPr>
+      </w:pPr>
+      <w:r>
+        <w:rPr>
+          <w:rFonts w:ascii="Times New Roman" w:hAnsi="Times New Roman" w:cs="Times New Roman"/>
+        </w:rPr>
+        <w:t>„</w:t>
+      </w:r>
+      <w:proofErr w:type="spellStart"/>
+      <w:r>
+        <w:rPr>
+          <w:rFonts w:ascii="Times New Roman" w:hAnsi="Times New Roman" w:cs="Times New Roman"/>
+        </w:rPr>
+        <w:t>git</w:t>
+      </w:r>
+      <w:proofErr w:type="spellEnd"/>
+      <w:r>
+        <w:rPr>
+          <w:rFonts w:ascii="Times New Roman" w:hAnsi="Times New Roman" w:cs="Times New Roman"/>
+        </w:rPr>
+        <w:t xml:space="preserve"> </w:t>
+      </w:r>
+      <w:proofErr w:type="spellStart"/>
+      <w:r>
+        <w:rPr>
+          <w:rFonts w:ascii="Times New Roman" w:hAnsi="Times New Roman" w:cs="Times New Roman"/>
+        </w:rPr>
+        <w:t>checkout</w:t>
+      </w:r>
+      <w:proofErr w:type="spellEnd"/>
+      <w:r>
+        <w:rPr>
+          <w:rFonts w:ascii="Times New Roman" w:hAnsi="Times New Roman" w:cs="Times New Roman"/>
+        </w:rPr>
+        <w:t xml:space="preserve"> Skaiciavimai.py</w:t>
+      </w:r>
+      <w:r>
+        <w:rPr>
+          <w:rFonts w:ascii="Times New Roman" w:hAnsi="Times New Roman" w:cs="Times New Roman"/>
+        </w:rPr>
+        <w:t>“</w:t>
+      </w:r>
     </w:p>
     <w:sectPr>
       <w:pgSz w:w="11906" w:h="16838"/>
@@ -840,6 +1476,10 @@
     </w:sectPr>
   </w:body>
 </w:document>
+</file>
+
+<file path=word/numbering.xml><?xml version="1.0" encoding="utf-8"?>
+<w:numbering xmlns:wpc="http://schemas.microsoft.com/office/word/2010/wordprocessingCanvas" xmlns:cx="http://schemas.microsoft.com/office/drawing/2014/chartex" xmlns:cx1="http://schemas.microsoft.com/office/drawing/2015/9/8/chartex" xmlns:cx2="http://schemas.microsoft.com/office/drawing/2015/10/21/chartex" xmlns:cx3="http://schemas.microsoft.com/office/drawing/2016/5/9/chartex" xmlns:cx4="http://schemas.microsoft.com/office/drawing/2016/5/10/chartex" xmlns:cx5="http://schemas.microsoft.com/office/drawing/2016/5/11/chartex" xmlns:cx6="http://schemas.microsoft.com/office/drawing/2016/5/12/chartex" xmlns:cx7="http://schemas.microsoft.com/office/drawing/2016/5/13/chartex" xmlns:cx8="http://schemas.microsoft.com/office/drawing/2016/5/14/chartex" xmlns:mc="http://schemas.openxmlformats.org/markup-compatibility/2006" xmlns:aink="http://schemas.microsoft.com/office/drawing/2016/ink" xmlns:am3d="http://schemas.microsoft.com/office/drawing/2017/model3d" xmlns:o="urn:schemas-microsoft-com:office:office" xmlns:oel="http://schemas.microsoft.com/office/2019/extlst" xmlns:r="http://schemas.openxmlformats.org/officeDocument/2006/relationships" xmlns:m="http://schemas.openxmlformats.org/officeDocument/2006/math" xmlns:v="urn:schemas-microsoft-com:vml" xmlns:wp14="http://schemas.microsoft.com/office/word/2010/wordprocessingDrawing" xmlns:wp="http://schemas.openxmlformats.org/drawingml/2006/wordprocessingDrawing" xmlns:w10="urn:schemas-microsoft-com:office:word" xmlns:w="http://schemas.openxmlformats.org/wordprocessingml/2006/main" xmlns:w14="http://schemas.microsoft.com/office/word/2010/wordml" xmlns:w15="http://schemas.microsoft.com/office/word/2012/wordml" xmlns:w16cex="http://schemas.microsoft.com/office/word/2018/wordml/cex" xmlns:w16cid="http://schemas.microsoft.com/office/word/2016/wordml/cid" xmlns:w16="http://schemas.microsoft.com/office/word/2018/wordml" xmlns:w16du="http://schemas.microsoft.com/office/word/2023/wordml/word16du" xmlns:w16sdtdh="http://schemas.microsoft.com/office/word/2020/wordml/sdtdatahash" xmlns:w16sdtfl="http://schemas.microsoft.com/office/word/2024/wordml/sdtformatlock" xmlns:w16se="http://schemas.microsoft.com/office/word/2015/wordml/symex" xmlns:wpg="http://schemas.microsoft.com/office/word/2010/wordprocessingGroup" xmlns:wpi="http://schemas.microsoft.com/office/word/2010/wordprocessingInk" xmlns:wne="http://schemas.microsoft.com/office/word/2006/wordml" xmlns:wps="http://schemas.microsoft.com/office/word/2010/wordprocessingShape" mc:Ignorable="w14 w15 w16se w16cid w16 w16cex w16sdtdh w16sdtfl w16du wp14"/>
 </file>
 
 <file path=word/styles.xml><?xml version="1.0" encoding="utf-8"?>
@@ -1758,6 +2398,59 @@
       <w:spacing w:val="5"/>
     </w:rPr>
   </w:style>
+  <w:style w:type="character" w:styleId="Hipersaitas">
+    <w:name w:val="Hyperlink"/>
+    <w:basedOn w:val="Numatytasispastraiposriftas"/>
+    <w:uiPriority w:val="99"/>
+    <w:unhideWhenUsed/>
+    <w:rsid w:val="00D2413D"/>
+    <w:rPr>
+      <w:color w:val="467886" w:themeColor="hyperlink"/>
+      <w:u w:val="single"/>
+    </w:rPr>
+  </w:style>
+  <w:style w:type="character" w:styleId="Neapdorotaspaminjimas">
+    <w:name w:val="Unresolved Mention"/>
+    <w:basedOn w:val="Numatytasispastraiposriftas"/>
+    <w:uiPriority w:val="99"/>
+    <w:semiHidden/>
+    <w:unhideWhenUsed/>
+    <w:rsid w:val="00D2413D"/>
+    <w:rPr>
+      <w:color w:val="605E5C"/>
+      <w:shd w:val="clear" w:color="auto" w:fill="E1DFDD"/>
+    </w:rPr>
+  </w:style>
+  <w:style w:type="paragraph" w:styleId="HTMLiankstoformatuotas">
+    <w:name w:val="HTML Preformatted"/>
+    <w:basedOn w:val="prastasis"/>
+    <w:link w:val="HTMLiankstoformatuotasDiagrama"/>
+    <w:uiPriority w:val="99"/>
+    <w:semiHidden/>
+    <w:unhideWhenUsed/>
+    <w:rsid w:val="008E02E3"/>
+    <w:pPr>
+      <w:spacing w:after="0" w:line="240" w:lineRule="auto"/>
+    </w:pPr>
+    <w:rPr>
+      <w:rFonts w:ascii="Consolas" w:hAnsi="Consolas"/>
+      <w:sz w:val="20"/>
+      <w:szCs w:val="20"/>
+    </w:rPr>
+  </w:style>
+  <w:style w:type="character" w:customStyle="1" w:styleId="HTMLiankstoformatuotasDiagrama">
+    <w:name w:val="HTML iš anksto formatuotas Diagrama"/>
+    <w:basedOn w:val="Numatytasispastraiposriftas"/>
+    <w:link w:val="HTMLiankstoformatuotas"/>
+    <w:uiPriority w:val="99"/>
+    <w:semiHidden/>
+    <w:rsid w:val="008E02E3"/>
+    <w:rPr>
+      <w:rFonts w:ascii="Consolas" w:hAnsi="Consolas"/>
+      <w:sz w:val="20"/>
+      <w:szCs w:val="20"/>
+    </w:rPr>
+  </w:style>
 </w:styles>
 </file>
 
@@ -2054,4 +2747,317 @@
     </a:ext>
   </a:extLst>
 </a:theme>
+</file>
+
+<file path=customXml/item1.xml><?xml version="1.0" encoding="utf-8"?>
+<p:properties xmlns:p="http://schemas.microsoft.com/office/2006/metadata/properties" xmlns:xsi="http://www.w3.org/2001/XMLSchema-instance" xmlns:pc="http://schemas.microsoft.com/office/infopath/2007/PartnerControls">
+  <documentManagement>
+    <lcf76f155ced4ddcb4097134ff3c332f xmlns="453e7e53-5eb2-45cf-b2ab-34c867e554b8">
+      <Terms xmlns="http://schemas.microsoft.com/office/infopath/2007/PartnerControls"/>
+    </lcf76f155ced4ddcb4097134ff3c332f>
+    <TaxCatchAll xmlns="aa0d983d-359a-438c-9953-3af1a8ac0831" xsi:nil="true"/>
+  </documentManagement>
+</p:properties>
+</file>
+
+<file path=customXml/item2.xml><?xml version="1.0" encoding="utf-8"?>
+<?mso-contentType ?>
+<FormTemplates xmlns="http://schemas.microsoft.com/sharepoint/v3/contenttype/forms">
+  <Display>DocumentLibraryForm</Display>
+  <Edit>DocumentLibraryForm</Edit>
+  <New>DocumentLibraryForm</New>
+</FormTemplates>
+</file>
+
+<file path=customXml/item3.xml><?xml version="1.0" encoding="utf-8"?>
+<ct:contentTypeSchema xmlns:ct="http://schemas.microsoft.com/office/2006/metadata/contentType" xmlns:ma="http://schemas.microsoft.com/office/2006/metadata/properties/metaAttributes" ct:_="" ma:_="" ma:contentTypeName="Dokumentas" ma:contentTypeID="0x010100BAB57CF81AE55C4698AAD22D302297F0" ma:contentTypeVersion="18" ma:contentTypeDescription="Kurkite naują dokumentą." ma:contentTypeScope="" ma:versionID="49ab401eb4052690d2a2629974c22fd6">
+  <xsd:schema xmlns:xsd="http://www.w3.org/2001/XMLSchema" xmlns:xs="http://www.w3.org/2001/XMLSchema" xmlns:p="http://schemas.microsoft.com/office/2006/metadata/properties" xmlns:ns2="453e7e53-5eb2-45cf-b2ab-34c867e554b8" xmlns:ns3="aa0d983d-359a-438c-9953-3af1a8ac0831" targetNamespace="http://schemas.microsoft.com/office/2006/metadata/properties" ma:root="true" ma:fieldsID="ab9969d50e0b13c63bc5bd0499c928dc" ns2:_="" ns3:_="">
+    <xsd:import namespace="453e7e53-5eb2-45cf-b2ab-34c867e554b8"/>
+    <xsd:import namespace="aa0d983d-359a-438c-9953-3af1a8ac0831"/>
+    <xsd:element name="properties">
+      <xsd:complexType>
+        <xsd:sequence>
+          <xsd:element name="documentManagement">
+            <xsd:complexType>
+              <xsd:all>
+                <xsd:element ref="ns2:MediaServiceMetadata" minOccurs="0"/>
+                <xsd:element ref="ns2:MediaServiceFastMetadata" minOccurs="0"/>
+                <xsd:element ref="ns2:MediaServiceDateTaken" minOccurs="0"/>
+                <xsd:element ref="ns2:MediaServiceAutoTags" minOccurs="0"/>
+                <xsd:element ref="ns2:MediaServiceOCR" minOccurs="0"/>
+                <xsd:element ref="ns2:MediaServiceGenerationTime" minOccurs="0"/>
+                <xsd:element ref="ns2:MediaServiceEventHashCode" minOccurs="0"/>
+                <xsd:element ref="ns2:MediaServiceAutoKeyPoints" minOccurs="0"/>
+                <xsd:element ref="ns2:MediaServiceKeyPoints" minOccurs="0"/>
+                <xsd:element ref="ns2:lcf76f155ced4ddcb4097134ff3c332f" minOccurs="0"/>
+                <xsd:element ref="ns3:TaxCatchAll" minOccurs="0"/>
+                <xsd:element ref="ns2:MediaServiceLocation" minOccurs="0"/>
+                <xsd:element ref="ns3:SharedWithUsers" minOccurs="0"/>
+                <xsd:element ref="ns3:SharedWithDetails" minOccurs="0"/>
+                <xsd:element ref="ns2:MediaServiceObjectDetectorVersions" minOccurs="0"/>
+                <xsd:element ref="ns2:MediaLengthInSeconds" minOccurs="0"/>
+                <xsd:element ref="ns2:MediaServiceSearchProperties" minOccurs="0"/>
+              </xsd:all>
+            </xsd:complexType>
+          </xsd:element>
+        </xsd:sequence>
+      </xsd:complexType>
+    </xsd:element>
+  </xsd:schema>
+  <xsd:schema xmlns:xsd="http://www.w3.org/2001/XMLSchema" xmlns:xs="http://www.w3.org/2001/XMLSchema" xmlns:dms="http://schemas.microsoft.com/office/2006/documentManagement/types" xmlns:pc="http://schemas.microsoft.com/office/infopath/2007/PartnerControls" targetNamespace="453e7e53-5eb2-45cf-b2ab-34c867e554b8" elementFormDefault="qualified">
+    <xsd:import namespace="http://schemas.microsoft.com/office/2006/documentManagement/types"/>
+    <xsd:import namespace="http://schemas.microsoft.com/office/infopath/2007/PartnerControls"/>
+    <xsd:element name="MediaServiceMetadata" ma:index="8" nillable="true" ma:displayName="MediaServiceMetadata" ma:hidden="true" ma:internalName="MediaServiceMetadata" ma:readOnly="true">
+      <xsd:simpleType>
+        <xsd:restriction base="dms:Note"/>
+      </xsd:simpleType>
+    </xsd:element>
+    <xsd:element name="MediaServiceFastMetadata" ma:index="9" nillable="true" ma:displayName="MediaServiceFastMetadata" ma:hidden="true" ma:internalName="MediaServiceFastMetadata" ma:readOnly="true">
+      <xsd:simpleType>
+        <xsd:restriction base="dms:Note"/>
+      </xsd:simpleType>
+    </xsd:element>
+    <xsd:element name="MediaServiceDateTaken" ma:index="10" nillable="true" ma:displayName="MediaServiceDateTaken" ma:hidden="true" ma:internalName="MediaServiceDateTaken" ma:readOnly="true">
+      <xsd:simpleType>
+        <xsd:restriction base="dms:Text"/>
+      </xsd:simpleType>
+    </xsd:element>
+    <xsd:element name="MediaServiceAutoTags" ma:index="11" nillable="true" ma:displayName="Tags" ma:internalName="MediaServiceAutoTags" ma:readOnly="true">
+      <xsd:simpleType>
+        <xsd:restriction base="dms:Text"/>
+      </xsd:simpleType>
+    </xsd:element>
+    <xsd:element name="MediaServiceOCR" ma:index="12" nillable="true" ma:displayName="Extracted Text" ma:internalName="MediaServiceOCR" ma:readOnly="true">
+      <xsd:simpleType>
+        <xsd:restriction base="dms:Note">
+          <xsd:maxLength value="255"/>
+        </xsd:restriction>
+      </xsd:simpleType>
+    </xsd:element>
+    <xsd:element name="MediaServiceGenerationTime" ma:index="13" nillable="true" ma:displayName="MediaServiceGenerationTime" ma:hidden="true" ma:internalName="MediaServiceGenerationTime" ma:readOnly="true">
+      <xsd:simpleType>
+        <xsd:restriction base="dms:Text"/>
+      </xsd:simpleType>
+    </xsd:element>
+    <xsd:element name="MediaServiceEventHashCode" ma:index="14" nillable="true" ma:displayName="MediaServiceEventHashCode" ma:hidden="true" ma:internalName="MediaServiceEventHashCode" ma:readOnly="true">
+      <xsd:simpleType>
+        <xsd:restriction base="dms:Text"/>
+      </xsd:simpleType>
+    </xsd:element>
+    <xsd:element name="MediaServiceAutoKeyPoints" ma:index="15" nillable="true" ma:displayName="MediaServiceAutoKeyPoints" ma:hidden="true" ma:internalName="MediaServiceAutoKeyPoints" ma:readOnly="true">
+      <xsd:simpleType>
+        <xsd:restriction base="dms:Note"/>
+      </xsd:simpleType>
+    </xsd:element>
+    <xsd:element name="MediaServiceKeyPoints" ma:index="16" nillable="true" ma:displayName="KeyPoints" ma:internalName="MediaServiceKeyPoints" ma:readOnly="true">
+      <xsd:simpleType>
+        <xsd:restriction base="dms:Note">
+          <xsd:maxLength value="255"/>
+        </xsd:restriction>
+      </xsd:simpleType>
+    </xsd:element>
+    <xsd:element name="lcf76f155ced4ddcb4097134ff3c332f" ma:index="18" nillable="true" ma:taxonomy="true" ma:internalName="lcf76f155ced4ddcb4097134ff3c332f" ma:taxonomyFieldName="MediaServiceImageTags" ma:displayName="Vaizdų žymės" ma:readOnly="false" ma:fieldId="{5cf76f15-5ced-4ddc-b409-7134ff3c332f}" ma:taxonomyMulti="true" ma:sspId="993cf2ba-b7a7-49f7-97d1-76e12a88c412" ma:termSetId="09814cd3-568e-fe90-9814-8d621ff8fb84" ma:anchorId="fba54fb3-c3e1-fe81-a776-ca4b69148c4d" ma:open="true" ma:isKeyword="false">
+      <xsd:complexType>
+        <xsd:sequence>
+          <xsd:element ref="pc:Terms" minOccurs="0" maxOccurs="1"/>
+        </xsd:sequence>
+      </xsd:complexType>
+    </xsd:element>
+    <xsd:element name="MediaServiceLocation" ma:index="20" nillable="true" ma:displayName="Location" ma:indexed="true" ma:internalName="MediaServiceLocation" ma:readOnly="true">
+      <xsd:simpleType>
+        <xsd:restriction base="dms:Text"/>
+      </xsd:simpleType>
+    </xsd:element>
+    <xsd:element name="MediaServiceObjectDetectorVersions" ma:index="23" nillable="true" ma:displayName="MediaServiceObjectDetectorVersions" ma:hidden="true" ma:indexed="true" ma:internalName="MediaServiceObjectDetectorVersions" ma:readOnly="true">
+      <xsd:simpleType>
+        <xsd:restriction base="dms:Text"/>
+      </xsd:simpleType>
+    </xsd:element>
+    <xsd:element name="MediaLengthInSeconds" ma:index="24" nillable="true" ma:displayName="MediaLengthInSeconds" ma:hidden="true" ma:internalName="MediaLengthInSeconds" ma:readOnly="true">
+      <xsd:simpleType>
+        <xsd:restriction base="dms:Unknown"/>
+      </xsd:simpleType>
+    </xsd:element>
+    <xsd:element name="MediaServiceSearchProperties" ma:index="25" nillable="true" ma:displayName="MediaServiceSearchProperties" ma:hidden="true" ma:internalName="MediaServiceSearchProperties" ma:readOnly="true">
+      <xsd:simpleType>
+        <xsd:restriction base="dms:Note"/>
+      </xsd:simpleType>
+    </xsd:element>
+  </xsd:schema>
+  <xsd:schema xmlns:xsd="http://www.w3.org/2001/XMLSchema" xmlns:xs="http://www.w3.org/2001/XMLSchema" xmlns:dms="http://schemas.microsoft.com/office/2006/documentManagement/types" xmlns:pc="http://schemas.microsoft.com/office/infopath/2007/PartnerControls" targetNamespace="aa0d983d-359a-438c-9953-3af1a8ac0831" elementFormDefault="qualified">
+    <xsd:import namespace="http://schemas.microsoft.com/office/2006/documentManagement/types"/>
+    <xsd:import namespace="http://schemas.microsoft.com/office/infopath/2007/PartnerControls"/>
+    <xsd:element name="TaxCatchAll" ma:index="19" nillable="true" ma:displayName="Taxonomy Catch All Column" ma:hidden="true" ma:list="{82c4fa3c-500e-4213-91e5-1b9e2014ea63}" ma:internalName="TaxCatchAll" ma:showField="CatchAllData" ma:web="aa0d983d-359a-438c-9953-3af1a8ac0831">
+      <xsd:complexType>
+        <xsd:complexContent>
+          <xsd:extension base="dms:MultiChoiceLookup">
+            <xsd:sequence>
+              <xsd:element name="Value" type="dms:Lookup" maxOccurs="unbounded" minOccurs="0" nillable="true"/>
+            </xsd:sequence>
+          </xsd:extension>
+        </xsd:complexContent>
+      </xsd:complexType>
+    </xsd:element>
+    <xsd:element name="SharedWithUsers" ma:index="21" nillable="true" ma:displayName="Bendrinama su" ma:internalName="SharedWithUsers" ma:readOnly="true">
+      <xsd:complexType>
+        <xsd:complexContent>
+          <xsd:extension base="dms:UserMulti">
+            <xsd:sequence>
+              <xsd:element name="UserInfo" minOccurs="0" maxOccurs="unbounded">
+                <xsd:complexType>
+                  <xsd:sequence>
+                    <xsd:element name="DisplayName" type="xsd:string" minOccurs="0"/>
+                    <xsd:element name="AccountId" type="dms:UserId" minOccurs="0" nillable="true"/>
+                    <xsd:element name="AccountType" type="xsd:string" minOccurs="0"/>
+                  </xsd:sequence>
+                </xsd:complexType>
+              </xsd:element>
+            </xsd:sequence>
+          </xsd:extension>
+        </xsd:complexContent>
+      </xsd:complexType>
+    </xsd:element>
+    <xsd:element name="SharedWithDetails" ma:index="22" nillable="true" ma:displayName="Bendrinta su išsamia informacija" ma:internalName="SharedWithDetails" ma:readOnly="true">
+      <xsd:simpleType>
+        <xsd:restriction base="dms:Note">
+          <xsd:maxLength value="255"/>
+        </xsd:restriction>
+      </xsd:simpleType>
+    </xsd:element>
+  </xsd:schema>
+  <xsd:schema xmlns="http://schemas.openxmlformats.org/package/2006/metadata/core-properties" xmlns:xsd="http://www.w3.org/2001/XMLSchema" xmlns:xsi="http://www.w3.org/2001/XMLSchema-instance" xmlns:dc="http://purl.org/dc/elements/1.1/" xmlns:dcterms="http://purl.org/dc/terms/" xmlns:odoc="http://schemas.microsoft.com/internal/obd" targetNamespace="http://schemas.openxmlformats.org/package/2006/metadata/core-properties" elementFormDefault="qualified" attributeFormDefault="unqualified" blockDefault="#all">
+    <xsd:import namespace="http://purl.org/dc/elements/1.1/" schemaLocation="http://dublincore.org/schemas/xmls/qdc/2003/04/02/dc.xsd"/>
+    <xsd:import namespace="http://purl.org/dc/terms/" schemaLocation="http://dublincore.org/schemas/xmls/qdc/2003/04/02/dcterms.xsd"/>
+    <xsd:element name="coreProperties" type="CT_coreProperties"/>
+    <xsd:complexType name="CT_coreProperties">
+      <xsd:all>
+        <xsd:element ref="dc:creator" minOccurs="0" maxOccurs="1"/>
+        <xsd:element ref="dcterms:created" minOccurs="0" maxOccurs="1"/>
+        <xsd:element ref="dc:identifier" minOccurs="0" maxOccurs="1"/>
+        <xsd:element name="contentType" minOccurs="0" maxOccurs="1" type="xsd:string" ma:index="0" ma:displayName="Turinio tipas"/>
+        <xsd:element ref="dc:title" minOccurs="0" maxOccurs="1" ma:index="4" ma:displayName="Antraštė"/>
+        <xsd:element ref="dc:subject" minOccurs="0" maxOccurs="1"/>
+        <xsd:element ref="dc:description" minOccurs="0" maxOccurs="1"/>
+        <xsd:element name="keywords" minOccurs="0" maxOccurs="1" type="xsd:string"/>
+        <xsd:element ref="dc:language" minOccurs="0" maxOccurs="1"/>
+        <xsd:element name="category" minOccurs="0" maxOccurs="1" type="xsd:string"/>
+        <xsd:element name="version" minOccurs="0" maxOccurs="1" type="xsd:string"/>
+        <xsd:element name="revision" minOccurs="0" maxOccurs="1" type="xsd:string">
+          <xsd:annotation>
+            <xsd:documentation>
+                        This value indicates the number of saves or revisions. The application is responsible for updating this value after each revision.
+                    </xsd:documentation>
+          </xsd:annotation>
+        </xsd:element>
+        <xsd:element name="lastModifiedBy" minOccurs="0" maxOccurs="1" type="xsd:string"/>
+        <xsd:element ref="dcterms:modified" minOccurs="0" maxOccurs="1"/>
+        <xsd:element name="contentStatus" minOccurs="0" maxOccurs="1" type="xsd:string"/>
+      </xsd:all>
+    </xsd:complexType>
+  </xsd:schema>
+  <xs:schema xmlns:pc="http://schemas.microsoft.com/office/infopath/2007/PartnerControls" xmlns:xs="http://www.w3.org/2001/XMLSchema" targetNamespace="http://schemas.microsoft.com/office/infopath/2007/PartnerControls" elementFormDefault="qualified" attributeFormDefault="unqualified">
+    <xs:element name="Person">
+      <xs:complexType>
+        <xs:sequence>
+          <xs:element ref="pc:DisplayName" minOccurs="0"/>
+          <xs:element ref="pc:AccountId" minOccurs="0"/>
+          <xs:element ref="pc:AccountType" minOccurs="0"/>
+        </xs:sequence>
+      </xs:complexType>
+    </xs:element>
+    <xs:element name="DisplayName" type="xs:string"/>
+    <xs:element name="AccountId" type="xs:string"/>
+    <xs:element name="AccountType" type="xs:string"/>
+    <xs:element name="BDCAssociatedEntity">
+      <xs:complexType>
+        <xs:sequence>
+          <xs:element ref="pc:BDCEntity" minOccurs="0" maxOccurs="unbounded"/>
+        </xs:sequence>
+        <xs:attribute ref="pc:EntityNamespace"/>
+        <xs:attribute ref="pc:EntityName"/>
+        <xs:attribute ref="pc:SystemInstanceName"/>
+        <xs:attribute ref="pc:AssociationName"/>
+      </xs:complexType>
+    </xs:element>
+    <xs:attribute name="EntityNamespace" type="xs:string"/>
+    <xs:attribute name="EntityName" type="xs:string"/>
+    <xs:attribute name="SystemInstanceName" type="xs:string"/>
+    <xs:attribute name="AssociationName" type="xs:string"/>
+    <xs:element name="BDCEntity">
+      <xs:complexType>
+        <xs:sequence>
+          <xs:element ref="pc:EntityDisplayName" minOccurs="0"/>
+          <xs:element ref="pc:EntityInstanceReference" minOccurs="0"/>
+          <xs:element ref="pc:EntityId1" minOccurs="0"/>
+          <xs:element ref="pc:EntityId2" minOccurs="0"/>
+          <xs:element ref="pc:EntityId3" minOccurs="0"/>
+          <xs:element ref="pc:EntityId4" minOccurs="0"/>
+          <xs:element ref="pc:EntityId5" minOccurs="0"/>
+        </xs:sequence>
+      </xs:complexType>
+    </xs:element>
+    <xs:element name="EntityDisplayName" type="xs:string"/>
+    <xs:element name="EntityInstanceReference" type="xs:string"/>
+    <xs:element name="EntityId1" type="xs:string"/>
+    <xs:element name="EntityId2" type="xs:string"/>
+    <xs:element name="EntityId3" type="xs:string"/>
+    <xs:element name="EntityId4" type="xs:string"/>
+    <xs:element name="EntityId5" type="xs:string"/>
+    <xs:element name="Terms">
+      <xs:complexType>
+        <xs:sequence>
+          <xs:element ref="pc:TermInfo" minOccurs="0" maxOccurs="unbounded"/>
+        </xs:sequence>
+      </xs:complexType>
+    </xs:element>
+    <xs:element name="TermInfo">
+      <xs:complexType>
+        <xs:sequence>
+          <xs:element ref="pc:TermName" minOccurs="0"/>
+          <xs:element ref="pc:TermId" minOccurs="0"/>
+        </xs:sequence>
+      </xs:complexType>
+    </xs:element>
+    <xs:element name="TermName" type="xs:string"/>
+    <xs:element name="TermId" type="xs:string"/>
+  </xs:schema>
+</ct:contentTypeSchema>
+</file>
+
+<file path=customXml/itemProps1.xml><?xml version="1.0" encoding="utf-8"?>
+<ds:datastoreItem xmlns:ds="http://schemas.openxmlformats.org/officeDocument/2006/customXml" ds:itemID="{F60541F1-77D1-4D68-8604-0A22CB6F387E}">
+  <ds:schemaRefs>
+    <ds:schemaRef ds:uri="http://schemas.microsoft.com/office/2006/metadata/properties"/>
+    <ds:schemaRef ds:uri="http://schemas.microsoft.com/office/infopath/2007/PartnerControls"/>
+    <ds:schemaRef ds:uri="453e7e53-5eb2-45cf-b2ab-34c867e554b8"/>
+    <ds:schemaRef ds:uri="aa0d983d-359a-438c-9953-3af1a8ac0831"/>
+  </ds:schemaRefs>
+</ds:datastoreItem>
+</file>
+
+<file path=customXml/itemProps2.xml><?xml version="1.0" encoding="utf-8"?>
+<ds:datastoreItem xmlns:ds="http://schemas.openxmlformats.org/officeDocument/2006/customXml" ds:itemID="{7A27E356-87D0-433D-89DE-32A74305A570}">
+  <ds:schemaRefs>
+    <ds:schemaRef ds:uri="http://schemas.microsoft.com/sharepoint/v3/contenttype/forms"/>
+  </ds:schemaRefs>
+</ds:datastoreItem>
+</file>
+
+<file path=customXml/itemProps3.xml><?xml version="1.0" encoding="utf-8"?>
+<ds:datastoreItem xmlns:ds="http://schemas.openxmlformats.org/officeDocument/2006/customXml" ds:itemID="{8121321F-A483-4EBD-B7DF-6173EAC05792}">
+  <ds:schemaRefs>
+    <ds:schemaRef ds:uri="http://schemas.microsoft.com/office/2006/metadata/contentType"/>
+    <ds:schemaRef ds:uri="http://schemas.microsoft.com/office/2006/metadata/properties/metaAttributes"/>
+    <ds:schemaRef ds:uri="http://www.w3.org/2001/XMLSchema"/>
+    <ds:schemaRef ds:uri="http://schemas.microsoft.com/office/2006/metadata/properties"/>
+    <ds:schemaRef ds:uri="453e7e53-5eb2-45cf-b2ab-34c867e554b8"/>
+    <ds:schemaRef ds:uri="aa0d983d-359a-438c-9953-3af1a8ac0831"/>
+    <ds:schemaRef ds:uri="http://schemas.microsoft.com/office/2006/documentManagement/types"/>
+    <ds:schemaRef ds:uri="http://schemas.microsoft.com/office/infopath/2007/PartnerControls"/>
+    <ds:schemaRef ds:uri="http://schemas.openxmlformats.org/package/2006/metadata/core-properties"/>
+    <ds:schemaRef ds:uri="http://purl.org/dc/elements/1.1/"/>
+    <ds:schemaRef ds:uri="http://purl.org/dc/terms/"/>
+    <ds:schemaRef ds:uri="http://schemas.microsoft.com/internal/obd"/>
+  </ds:schemaRefs>
+</ds:datastoreItem>
 </file>
</xml_diff>